<commit_message>
feat(laporan): laporan mingguan + kalender Indonesia + default DOCX
- Tambah endpoint /api/laporan/mingguan/:jenis (Perikanan, Perdata, Pidana, Hukum)
- Template mingguan-perikanan.docx dan mingguan-perdata.docx
- Auto-detect minggu ke (I–V) dari tanggal awal, substitusi bulan/tahun/hari
- Logika isi kolom: ✓ di SESUAI dan 'Sudah di Proses' di TINDAK LANJUT jika ada perkara
- Komponen IndonesiaCalendar.vue: kalender visual dengan hari libur & cuti bersama 2026
  (SKB 3 Menteri No. 1497/2025), range selection, hover preview, Senin-pertama
- Data holidays.js: 25 hari libur nasional + cuti bersama 2026
- MingguanFilterBar: ganti input teks dengan chip kalender popup
- Default format export berubah dari PDF ke DOCX (Mingguan & Bulanan)
- Perbaikan: tanggal kosong dipertahankan format template, bukan di-overwrite

Co-Authored-By: Claude Sonnet 4.6 <noreply@anthropic.com>
</commit_message>
<xml_diff>
--- a/backend/templates/bulanan-perdata.docx
+++ b/backend/templates/bulanan-perdata.docx
@@ -986,6 +986,7 @@
                 <w:tab w:val="left" w:leader="dot" w:pos="5245"/>
               </w:tabs>
               <w:ind w:left="-11" w:firstLine="0"/>
+              <w:jc w:val="center"/>
               <w:rPr>
                 <w:rFonts w:ascii="Arial" w:hAnsi="Arial" w:cs="Arial"/>
                 <w:sz w:val="20"/>
@@ -998,53 +999,7 @@
                 <w:sz w:val="20"/>
                 <w:szCs w:val="20"/>
               </w:rPr>
-              <w:t>1/Pdt.G/2026/PN Ntn</w:t>
-            </w:r>
-          </w:p>
-          <w:p>
-            <w:pPr>
-              <w:tabs>
-                <w:tab w:val="left" w:leader="dot" w:pos="3119"/>
-                <w:tab w:val="left" w:pos="3686"/>
-                <w:tab w:val="left" w:leader="dot" w:pos="5245"/>
-              </w:tabs>
-              <w:ind w:left="-11" w:firstLine="0"/>
-              <w:rPr>
-                <w:rFonts w:ascii="Arial" w:hAnsi="Arial" w:cs="Arial"/>
-                <w:sz w:val="20"/>
-                <w:szCs w:val="20"/>
-              </w:rPr>
-            </w:pPr>
-            <w:r>
-              <w:rPr>
-                <w:rFonts w:ascii="Arial" w:hAnsi="Arial" w:cs="Arial"/>
-                <w:sz w:val="20"/>
-                <w:szCs w:val="20"/>
-              </w:rPr>
-              <w:t>2/Pdt.G/2026/PN Ntn</w:t>
-            </w:r>
-          </w:p>
-          <w:p>
-            <w:pPr>
-              <w:tabs>
-                <w:tab w:val="left" w:leader="dot" w:pos="3119"/>
-                <w:tab w:val="left" w:pos="3686"/>
-                <w:tab w:val="left" w:leader="dot" w:pos="5245"/>
-              </w:tabs>
-              <w:ind w:left="-11" w:firstLine="0"/>
-              <w:rPr>
-                <w:rFonts w:ascii="Arial" w:hAnsi="Arial" w:cs="Arial"/>
-                <w:sz w:val="20"/>
-                <w:szCs w:val="20"/>
-              </w:rPr>
-            </w:pPr>
-            <w:r>
-              <w:rPr>
-                <w:rFonts w:ascii="Arial" w:hAnsi="Arial" w:cs="Arial"/>
-                <w:sz w:val="20"/>
-                <w:szCs w:val="20"/>
-              </w:rPr>
-              <w:t>2/Pdt.P/2026/PN Ntn</w:t>
+              <w:t>-</w:t>
             </w:r>
           </w:p>
         </w:tc>
@@ -1074,7 +1029,7 @@
                 <w:sz w:val="20"/>
                 <w:szCs w:val="20"/>
               </w:rPr>
-              <w:sym w:font="Symbol" w:char="F0D6"/>
+              <w:t>-</w:t>
             </w:r>
           </w:p>
         </w:tc>
@@ -1134,7 +1089,7 @@
                 <w:sz w:val="20"/>
                 <w:szCs w:val="20"/>
               </w:rPr>
-              <w:t>Sudah di Proses</w:t>
+              <w:t>-</w:t>
             </w:r>
           </w:p>
         </w:tc>
@@ -2238,6 +2193,14 @@
           <w:rFonts w:ascii="Arial" w:hAnsi="Arial" w:cs="Arial"/>
           <w:sz w:val="24"/>
           <w:szCs w:val="24"/>
+        </w:rPr>
+        <w:t xml:space="preserve">Wakil </w:t>
+      </w:r>
+      <w:r>
+        <w:rPr>
+          <w:rFonts w:ascii="Arial" w:hAnsi="Arial" w:cs="Arial"/>
+          <w:sz w:val="24"/>
+          <w:szCs w:val="24"/>
           <w:lang w:val="id-ID"/>
         </w:rPr>
         <w:t>Ketua Pengadilan Negeri Natuna</w:t>
@@ -2311,7 +2274,7 @@
           <w:sz w:val="24"/>
           <w:szCs w:val="24"/>
         </w:rPr>
-        <w:t>Lodewyk Ivandrie Simanjuntak</w:t>
+        <w:t>Joko Ciptanto</w:t>
       </w:r>
       <w:r>
         <w:rPr>

</xml_diff>